<commit_message>
SRS: add team SAP IDs
Co-Authored-By: Claude Opus 5.5 <noreply@anthropic.com>
</commit_message>
<xml_diff>
--- a/docs/mid-sem/TraceMap_SRS_MidTerm.docx
+++ b/docs/mid-sem/TraceMap_SRS_MidTerm.docx
@@ -287,7 +287,7 @@
                 <w:rFonts w:ascii="Times New Roman" w:hAnsi="Times New Roman" w:cs="Times New Roman" w:eastAsia="Times New Roman"/>
                 <w:sz w:val="24"/>
               </w:rPr>
-              <w:t>[SAP ID]</w:t>
+              <w:t>500119143</w:t>
             </w:r>
           </w:p>
         </w:tc>
@@ -355,7 +355,7 @@
                 <w:rFonts w:ascii="Times New Roman" w:hAnsi="Times New Roman" w:cs="Times New Roman" w:eastAsia="Times New Roman"/>
                 <w:sz w:val="24"/>
               </w:rPr>
-              <w:t>[SAP ID]</w:t>
+              <w:t>500122776</w:t>
             </w:r>
           </w:p>
         </w:tc>
@@ -423,7 +423,7 @@
                 <w:rFonts w:ascii="Times New Roman" w:hAnsi="Times New Roman" w:cs="Times New Roman" w:eastAsia="Times New Roman"/>
                 <w:sz w:val="24"/>
               </w:rPr>
-              <w:t>[SAP ID]</w:t>
+              <w:t>500123381</w:t>
             </w:r>
           </w:p>
         </w:tc>
@@ -491,7 +491,7 @@
                 <w:rFonts w:ascii="Times New Roman" w:hAnsi="Times New Roman" w:cs="Times New Roman" w:eastAsia="Times New Roman"/>
                 <w:sz w:val="24"/>
               </w:rPr>
-              <w:t>[SAP ID]</w:t>
+              <w:t>500120979</w:t>
             </w:r>
           </w:p>
         </w:tc>

</xml_diff>

<commit_message>
SRS: TOC on page 2, revision history on page 3; consistent front-matter formatting
Co-Authored-By: Claude Opus 5.5 <noreply@anthropic.com>
</commit_message>
<xml_diff>
--- a/docs/mid-sem/TraceMap_SRS_MidTerm.docx
+++ b/docs/mid-sem/TraceMap_SRS_MidTerm.docx
@@ -661,6 +661,9 @@
     <w:p xmlns:wp14="http://schemas.microsoft.com/office/word/2010/wordml" wp14:textId="77777777">
       <w:pPr>
         <w:pStyle w:val="TOCEntry"/>
+        <w:keepNext/>
+        <w:pageBreakBefore/>
+        <w:spacing w:before="0" w:after="240"/>
         <w:jc w:val="center"/>
         <w:rPr>
           <w:sz w:val="40"/>
@@ -670,6 +673,8 @@
       <w:bookmarkStart w:id="101" w:name="bm_toc"/>
       <w:r>
         <w:rPr>
+          <w:rFonts w:ascii="Times New Roman" w:hAnsi="Times New Roman" w:cs="Times New Roman" w:eastAsia="Times New Roman"/>
+          <w:b/>
           <w:sz w:val="40"/>
           <w:szCs w:val="40"/>
         </w:rPr>
@@ -784,35 +789,35 @@
             <w:r>
               <w:rPr>
                 <w:rFonts w:ascii="Times New Roman" w:hAnsi="Times New Roman" w:cs="Times New Roman" w:eastAsia="Times New Roman"/>
-                <w:sz w:val="24"/>
+                <w:sz w:val="28"/>
               </w:rPr>
               <w:fldChar w:fldCharType="begin"/>
             </w:r>
             <w:r>
               <w:rPr>
                 <w:rFonts w:ascii="Times New Roman" w:hAnsi="Times New Roman" w:cs="Times New Roman" w:eastAsia="Times New Roman"/>
-                <w:sz w:val="24"/>
+                <w:sz w:val="28"/>
               </w:rPr>
               <w:instrText xml:space="preserve"> PAGEREF bm_toc \h </w:instrText>
             </w:r>
             <w:r>
               <w:rPr>
                 <w:rFonts w:ascii="Times New Roman" w:hAnsi="Times New Roman" w:cs="Times New Roman" w:eastAsia="Times New Roman"/>
-                <w:sz w:val="24"/>
+                <w:sz w:val="28"/>
               </w:rPr>
               <w:fldChar w:fldCharType="separate"/>
             </w:r>
             <w:r>
               <w:rPr>
                 <w:rFonts w:ascii="Times New Roman" w:hAnsi="Times New Roman" w:cs="Times New Roman" w:eastAsia="Times New Roman"/>
-                <w:sz w:val="24"/>
-              </w:rPr>
-              <w:t xml:space="preserve"> </w:t>
-            </w:r>
-            <w:r>
-              <w:rPr>
-                <w:rFonts w:ascii="Times New Roman" w:hAnsi="Times New Roman" w:cs="Times New Roman" w:eastAsia="Times New Roman"/>
-                <w:sz w:val="24"/>
+                <w:sz w:val="28"/>
+              </w:rPr>
+              <w:t>2</w:t>
+            </w:r>
+            <w:r>
+              <w:rPr>
+                <w:rFonts w:ascii="Times New Roman" w:hAnsi="Times New Roman" w:cs="Times New Roman" w:eastAsia="Times New Roman"/>
+                <w:sz w:val="28"/>
               </w:rPr>
               <w:fldChar w:fldCharType="end"/>
             </w:r>
@@ -861,35 +866,35 @@
             <w:r>
               <w:rPr>
                 <w:rFonts w:ascii="Times New Roman" w:hAnsi="Times New Roman" w:cs="Times New Roman" w:eastAsia="Times New Roman"/>
-                <w:sz w:val="24"/>
+                <w:sz w:val="28"/>
               </w:rPr>
               <w:fldChar w:fldCharType="begin"/>
             </w:r>
             <w:r>
               <w:rPr>
                 <w:rFonts w:ascii="Times New Roman" w:hAnsi="Times New Roman" w:cs="Times New Roman" w:eastAsia="Times New Roman"/>
-                <w:sz w:val="24"/>
+                <w:sz w:val="28"/>
               </w:rPr>
               <w:instrText xml:space="preserve"> PAGEREF bm_rev \h </w:instrText>
             </w:r>
             <w:r>
               <w:rPr>
                 <w:rFonts w:ascii="Times New Roman" w:hAnsi="Times New Roman" w:cs="Times New Roman" w:eastAsia="Times New Roman"/>
-                <w:sz w:val="24"/>
+                <w:sz w:val="28"/>
               </w:rPr>
               <w:fldChar w:fldCharType="separate"/>
             </w:r>
             <w:r>
               <w:rPr>
                 <w:rFonts w:ascii="Times New Roman" w:hAnsi="Times New Roman" w:cs="Times New Roman" w:eastAsia="Times New Roman"/>
-                <w:sz w:val="24"/>
-              </w:rPr>
-              <w:t xml:space="preserve"> </w:t>
-            </w:r>
-            <w:r>
-              <w:rPr>
-                <w:rFonts w:ascii="Times New Roman" w:hAnsi="Times New Roman" w:cs="Times New Roman" w:eastAsia="Times New Roman"/>
-                <w:sz w:val="24"/>
+                <w:sz w:val="28"/>
+              </w:rPr>
+              <w:t>3</w:t>
+            </w:r>
+            <w:r>
+              <w:rPr>
+                <w:rFonts w:ascii="Times New Roman" w:hAnsi="Times New Roman" w:cs="Times New Roman" w:eastAsia="Times New Roman"/>
+                <w:sz w:val="28"/>
               </w:rPr>
               <w:fldChar w:fldCharType="end"/>
             </w:r>
@@ -960,35 +965,35 @@
             <w:r>
               <w:rPr>
                 <w:rFonts w:ascii="Times New Roman" w:hAnsi="Times New Roman" w:cs="Times New Roman" w:eastAsia="Times New Roman"/>
-                <w:sz w:val="24"/>
+                <w:sz w:val="28"/>
               </w:rPr>
               <w:fldChar w:fldCharType="begin"/>
             </w:r>
             <w:r>
               <w:rPr>
                 <w:rFonts w:ascii="Times New Roman" w:hAnsi="Times New Roman" w:cs="Times New Roman" w:eastAsia="Times New Roman"/>
-                <w:sz w:val="24"/>
+                <w:sz w:val="28"/>
               </w:rPr>
               <w:instrText xml:space="preserve"> PAGEREF bm_1 \h </w:instrText>
             </w:r>
             <w:r>
               <w:rPr>
                 <w:rFonts w:ascii="Times New Roman" w:hAnsi="Times New Roman" w:cs="Times New Roman" w:eastAsia="Times New Roman"/>
-                <w:sz w:val="24"/>
+                <w:sz w:val="28"/>
               </w:rPr>
               <w:fldChar w:fldCharType="separate"/>
             </w:r>
             <w:r>
               <w:rPr>
                 <w:rFonts w:ascii="Times New Roman" w:hAnsi="Times New Roman" w:cs="Times New Roman" w:eastAsia="Times New Roman"/>
-                <w:sz w:val="24"/>
-              </w:rPr>
-              <w:t xml:space="preserve"> </w:t>
-            </w:r>
-            <w:r>
-              <w:rPr>
-                <w:rFonts w:ascii="Times New Roman" w:hAnsi="Times New Roman" w:cs="Times New Roman" w:eastAsia="Times New Roman"/>
-                <w:sz w:val="24"/>
+                <w:sz w:val="28"/>
+              </w:rPr>
+              <w:t>4</w:t>
+            </w:r>
+            <w:r>
+              <w:rPr>
+                <w:rFonts w:ascii="Times New Roman" w:hAnsi="Times New Roman" w:cs="Times New Roman" w:eastAsia="Times New Roman"/>
+                <w:sz w:val="28"/>
               </w:rPr>
               <w:fldChar w:fldCharType="end"/>
             </w:r>
@@ -1051,35 +1056,35 @@
             <w:r>
               <w:rPr>
                 <w:rFonts w:ascii="Times New Roman" w:hAnsi="Times New Roman" w:cs="Times New Roman" w:eastAsia="Times New Roman"/>
-                <w:sz w:val="24"/>
+                <w:sz w:val="28"/>
               </w:rPr>
               <w:fldChar w:fldCharType="begin"/>
             </w:r>
             <w:r>
               <w:rPr>
                 <w:rFonts w:ascii="Times New Roman" w:hAnsi="Times New Roman" w:cs="Times New Roman" w:eastAsia="Times New Roman"/>
-                <w:sz w:val="24"/>
+                <w:sz w:val="28"/>
               </w:rPr>
               <w:instrText xml:space="preserve"> PAGEREF bm_1_1 \h </w:instrText>
             </w:r>
             <w:r>
               <w:rPr>
                 <w:rFonts w:ascii="Times New Roman" w:hAnsi="Times New Roman" w:cs="Times New Roman" w:eastAsia="Times New Roman"/>
-                <w:sz w:val="24"/>
+                <w:sz w:val="28"/>
               </w:rPr>
               <w:fldChar w:fldCharType="separate"/>
             </w:r>
             <w:r>
               <w:rPr>
                 <w:rFonts w:ascii="Times New Roman" w:hAnsi="Times New Roman" w:cs="Times New Roman" w:eastAsia="Times New Roman"/>
-                <w:sz w:val="24"/>
-              </w:rPr>
-              <w:t xml:space="preserve"> </w:t>
-            </w:r>
-            <w:r>
-              <w:rPr>
-                <w:rFonts w:ascii="Times New Roman" w:hAnsi="Times New Roman" w:cs="Times New Roman" w:eastAsia="Times New Roman"/>
-                <w:sz w:val="24"/>
+                <w:sz w:val="28"/>
+              </w:rPr>
+              <w:t>4</w:t>
+            </w:r>
+            <w:r>
+              <w:rPr>
+                <w:rFonts w:ascii="Times New Roman" w:hAnsi="Times New Roman" w:cs="Times New Roman" w:eastAsia="Times New Roman"/>
+                <w:sz w:val="28"/>
               </w:rPr>
               <w:fldChar w:fldCharType="end"/>
             </w:r>
@@ -1142,35 +1147,35 @@
             <w:r>
               <w:rPr>
                 <w:rFonts w:ascii="Times New Roman" w:hAnsi="Times New Roman" w:cs="Times New Roman" w:eastAsia="Times New Roman"/>
-                <w:sz w:val="24"/>
+                <w:sz w:val="28"/>
               </w:rPr>
               <w:fldChar w:fldCharType="begin"/>
             </w:r>
             <w:r>
               <w:rPr>
                 <w:rFonts w:ascii="Times New Roman" w:hAnsi="Times New Roman" w:cs="Times New Roman" w:eastAsia="Times New Roman"/>
-                <w:sz w:val="24"/>
+                <w:sz w:val="28"/>
               </w:rPr>
               <w:instrText xml:space="preserve"> PAGEREF bm_1_2 \h </w:instrText>
             </w:r>
             <w:r>
               <w:rPr>
                 <w:rFonts w:ascii="Times New Roman" w:hAnsi="Times New Roman" w:cs="Times New Roman" w:eastAsia="Times New Roman"/>
-                <w:sz w:val="24"/>
+                <w:sz w:val="28"/>
               </w:rPr>
               <w:fldChar w:fldCharType="separate"/>
             </w:r>
             <w:r>
               <w:rPr>
                 <w:rFonts w:ascii="Times New Roman" w:hAnsi="Times New Roman" w:cs="Times New Roman" w:eastAsia="Times New Roman"/>
-                <w:sz w:val="24"/>
-              </w:rPr>
-              <w:t xml:space="preserve"> </w:t>
-            </w:r>
-            <w:r>
-              <w:rPr>
-                <w:rFonts w:ascii="Times New Roman" w:hAnsi="Times New Roman" w:cs="Times New Roman" w:eastAsia="Times New Roman"/>
-                <w:sz w:val="24"/>
+                <w:sz w:val="28"/>
+              </w:rPr>
+              <w:t>4</w:t>
+            </w:r>
+            <w:r>
+              <w:rPr>
+                <w:rFonts w:ascii="Times New Roman" w:hAnsi="Times New Roman" w:cs="Times New Roman" w:eastAsia="Times New Roman"/>
+                <w:sz w:val="28"/>
               </w:rPr>
               <w:fldChar w:fldCharType="end"/>
             </w:r>
@@ -1233,35 +1238,35 @@
             <w:r>
               <w:rPr>
                 <w:rFonts w:ascii="Times New Roman" w:hAnsi="Times New Roman" w:cs="Times New Roman" w:eastAsia="Times New Roman"/>
-                <w:sz w:val="24"/>
+                <w:sz w:val="28"/>
               </w:rPr>
               <w:fldChar w:fldCharType="begin"/>
             </w:r>
             <w:r>
               <w:rPr>
                 <w:rFonts w:ascii="Times New Roman" w:hAnsi="Times New Roman" w:cs="Times New Roman" w:eastAsia="Times New Roman"/>
-                <w:sz w:val="24"/>
+                <w:sz w:val="28"/>
               </w:rPr>
               <w:instrText xml:space="preserve"> PAGEREF bm_1_3 \h </w:instrText>
             </w:r>
             <w:r>
               <w:rPr>
                 <w:rFonts w:ascii="Times New Roman" w:hAnsi="Times New Roman" w:cs="Times New Roman" w:eastAsia="Times New Roman"/>
-                <w:sz w:val="24"/>
+                <w:sz w:val="28"/>
               </w:rPr>
               <w:fldChar w:fldCharType="separate"/>
             </w:r>
             <w:r>
               <w:rPr>
                 <w:rFonts w:ascii="Times New Roman" w:hAnsi="Times New Roman" w:cs="Times New Roman" w:eastAsia="Times New Roman"/>
-                <w:sz w:val="24"/>
-              </w:rPr>
-              <w:t xml:space="preserve"> </w:t>
-            </w:r>
-            <w:r>
-              <w:rPr>
-                <w:rFonts w:ascii="Times New Roman" w:hAnsi="Times New Roman" w:cs="Times New Roman" w:eastAsia="Times New Roman"/>
-                <w:sz w:val="24"/>
+                <w:sz w:val="28"/>
+              </w:rPr>
+              <w:t>4</w:t>
+            </w:r>
+            <w:r>
+              <w:rPr>
+                <w:rFonts w:ascii="Times New Roman" w:hAnsi="Times New Roman" w:cs="Times New Roman" w:eastAsia="Times New Roman"/>
+                <w:sz w:val="28"/>
               </w:rPr>
               <w:fldChar w:fldCharType="end"/>
             </w:r>
@@ -1340,35 +1345,35 @@
             <w:r>
               <w:rPr>
                 <w:rFonts w:ascii="Times New Roman" w:hAnsi="Times New Roman" w:cs="Times New Roman" w:eastAsia="Times New Roman"/>
-                <w:sz w:val="24"/>
+                <w:sz w:val="28"/>
               </w:rPr>
               <w:fldChar w:fldCharType="begin"/>
             </w:r>
             <w:r>
               <w:rPr>
                 <w:rFonts w:ascii="Times New Roman" w:hAnsi="Times New Roman" w:cs="Times New Roman" w:eastAsia="Times New Roman"/>
-                <w:sz w:val="24"/>
+                <w:sz w:val="28"/>
               </w:rPr>
               <w:instrText xml:space="preserve"> PAGEREF bm_1_4 \h </w:instrText>
             </w:r>
             <w:r>
               <w:rPr>
                 <w:rFonts w:ascii="Times New Roman" w:hAnsi="Times New Roman" w:cs="Times New Roman" w:eastAsia="Times New Roman"/>
-                <w:sz w:val="24"/>
+                <w:sz w:val="28"/>
               </w:rPr>
               <w:fldChar w:fldCharType="separate"/>
             </w:r>
             <w:r>
               <w:rPr>
                 <w:rFonts w:ascii="Times New Roman" w:hAnsi="Times New Roman" w:cs="Times New Roman" w:eastAsia="Times New Roman"/>
-                <w:sz w:val="24"/>
-              </w:rPr>
-              <w:t xml:space="preserve"> </w:t>
-            </w:r>
-            <w:r>
-              <w:rPr>
-                <w:rFonts w:ascii="Times New Roman" w:hAnsi="Times New Roman" w:cs="Times New Roman" w:eastAsia="Times New Roman"/>
-                <w:sz w:val="24"/>
+                <w:sz w:val="28"/>
+              </w:rPr>
+              <w:t>5</w:t>
+            </w:r>
+            <w:r>
+              <w:rPr>
+                <w:rFonts w:ascii="Times New Roman" w:hAnsi="Times New Roman" w:cs="Times New Roman" w:eastAsia="Times New Roman"/>
+                <w:sz w:val="28"/>
               </w:rPr>
               <w:fldChar w:fldCharType="end"/>
             </w:r>
@@ -1439,35 +1444,35 @@
             <w:r>
               <w:rPr>
                 <w:rFonts w:ascii="Times New Roman" w:hAnsi="Times New Roman" w:cs="Times New Roman" w:eastAsia="Times New Roman"/>
-                <w:sz w:val="24"/>
+                <w:sz w:val="28"/>
               </w:rPr>
               <w:fldChar w:fldCharType="begin"/>
             </w:r>
             <w:r>
               <w:rPr>
                 <w:rFonts w:ascii="Times New Roman" w:hAnsi="Times New Roman" w:cs="Times New Roman" w:eastAsia="Times New Roman"/>
-                <w:sz w:val="24"/>
+                <w:sz w:val="28"/>
               </w:rPr>
               <w:instrText xml:space="preserve"> PAGEREF bm_2 \h </w:instrText>
             </w:r>
             <w:r>
               <w:rPr>
                 <w:rFonts w:ascii="Times New Roman" w:hAnsi="Times New Roman" w:cs="Times New Roman" w:eastAsia="Times New Roman"/>
-                <w:sz w:val="24"/>
+                <w:sz w:val="28"/>
               </w:rPr>
               <w:fldChar w:fldCharType="separate"/>
             </w:r>
             <w:r>
               <w:rPr>
                 <w:rFonts w:ascii="Times New Roman" w:hAnsi="Times New Roman" w:cs="Times New Roman" w:eastAsia="Times New Roman"/>
-                <w:sz w:val="24"/>
-              </w:rPr>
-              <w:t xml:space="preserve"> </w:t>
-            </w:r>
-            <w:r>
-              <w:rPr>
-                <w:rFonts w:ascii="Times New Roman" w:hAnsi="Times New Roman" w:cs="Times New Roman" w:eastAsia="Times New Roman"/>
-                <w:sz w:val="24"/>
+                <w:sz w:val="28"/>
+              </w:rPr>
+              <w:t>6</w:t>
+            </w:r>
+            <w:r>
+              <w:rPr>
+                <w:rFonts w:ascii="Times New Roman" w:hAnsi="Times New Roman" w:cs="Times New Roman" w:eastAsia="Times New Roman"/>
+                <w:sz w:val="28"/>
               </w:rPr>
               <w:fldChar w:fldCharType="end"/>
             </w:r>
@@ -1530,35 +1535,35 @@
             <w:r>
               <w:rPr>
                 <w:rFonts w:ascii="Times New Roman" w:hAnsi="Times New Roman" w:cs="Times New Roman" w:eastAsia="Times New Roman"/>
-                <w:sz w:val="24"/>
+                <w:sz w:val="28"/>
               </w:rPr>
               <w:fldChar w:fldCharType="begin"/>
             </w:r>
             <w:r>
               <w:rPr>
                 <w:rFonts w:ascii="Times New Roman" w:hAnsi="Times New Roman" w:cs="Times New Roman" w:eastAsia="Times New Roman"/>
-                <w:sz w:val="24"/>
+                <w:sz w:val="28"/>
               </w:rPr>
               <w:instrText xml:space="preserve"> PAGEREF bm_2_1 \h </w:instrText>
             </w:r>
             <w:r>
               <w:rPr>
                 <w:rFonts w:ascii="Times New Roman" w:hAnsi="Times New Roman" w:cs="Times New Roman" w:eastAsia="Times New Roman"/>
-                <w:sz w:val="24"/>
+                <w:sz w:val="28"/>
               </w:rPr>
               <w:fldChar w:fldCharType="separate"/>
             </w:r>
             <w:r>
               <w:rPr>
                 <w:rFonts w:ascii="Times New Roman" w:hAnsi="Times New Roman" w:cs="Times New Roman" w:eastAsia="Times New Roman"/>
-                <w:sz w:val="24"/>
-              </w:rPr>
-              <w:t xml:space="preserve"> </w:t>
-            </w:r>
-            <w:r>
-              <w:rPr>
-                <w:rFonts w:ascii="Times New Roman" w:hAnsi="Times New Roman" w:cs="Times New Roman" w:eastAsia="Times New Roman"/>
-                <w:sz w:val="24"/>
+                <w:sz w:val="28"/>
+              </w:rPr>
+              <w:t>6</w:t>
+            </w:r>
+            <w:r>
+              <w:rPr>
+                <w:rFonts w:ascii="Times New Roman" w:hAnsi="Times New Roman" w:cs="Times New Roman" w:eastAsia="Times New Roman"/>
+                <w:sz w:val="28"/>
               </w:rPr>
               <w:fldChar w:fldCharType="end"/>
             </w:r>
@@ -1637,35 +1642,35 @@
             <w:r>
               <w:rPr>
                 <w:rFonts w:ascii="Times New Roman" w:hAnsi="Times New Roman" w:cs="Times New Roman" w:eastAsia="Times New Roman"/>
-                <w:sz w:val="24"/>
+                <w:sz w:val="28"/>
               </w:rPr>
               <w:fldChar w:fldCharType="begin"/>
             </w:r>
             <w:r>
               <w:rPr>
                 <w:rFonts w:ascii="Times New Roman" w:hAnsi="Times New Roman" w:cs="Times New Roman" w:eastAsia="Times New Roman"/>
-                <w:sz w:val="24"/>
+                <w:sz w:val="28"/>
               </w:rPr>
               <w:instrText xml:space="preserve"> PAGEREF bm_2_2 \h </w:instrText>
             </w:r>
             <w:r>
               <w:rPr>
                 <w:rFonts w:ascii="Times New Roman" w:hAnsi="Times New Roman" w:cs="Times New Roman" w:eastAsia="Times New Roman"/>
-                <w:sz w:val="24"/>
+                <w:sz w:val="28"/>
               </w:rPr>
               <w:fldChar w:fldCharType="separate"/>
             </w:r>
             <w:r>
               <w:rPr>
                 <w:rFonts w:ascii="Times New Roman" w:hAnsi="Times New Roman" w:cs="Times New Roman" w:eastAsia="Times New Roman"/>
-                <w:sz w:val="24"/>
-              </w:rPr>
-              <w:t xml:space="preserve"> </w:t>
-            </w:r>
-            <w:r>
-              <w:rPr>
-                <w:rFonts w:ascii="Times New Roman" w:hAnsi="Times New Roman" w:cs="Times New Roman" w:eastAsia="Times New Roman"/>
-                <w:sz w:val="24"/>
+                <w:sz w:val="28"/>
+              </w:rPr>
+              <w:t>7</w:t>
+            </w:r>
+            <w:r>
+              <w:rPr>
+                <w:rFonts w:ascii="Times New Roman" w:hAnsi="Times New Roman" w:cs="Times New Roman" w:eastAsia="Times New Roman"/>
+                <w:sz w:val="28"/>
               </w:rPr>
               <w:fldChar w:fldCharType="end"/>
             </w:r>
@@ -1728,35 +1733,35 @@
             <w:r>
               <w:rPr>
                 <w:rFonts w:ascii="Times New Roman" w:hAnsi="Times New Roman" w:cs="Times New Roman" w:eastAsia="Times New Roman"/>
-                <w:sz w:val="24"/>
+                <w:sz w:val="28"/>
               </w:rPr>
               <w:fldChar w:fldCharType="begin"/>
             </w:r>
             <w:r>
               <w:rPr>
                 <w:rFonts w:ascii="Times New Roman" w:hAnsi="Times New Roman" w:cs="Times New Roman" w:eastAsia="Times New Roman"/>
-                <w:sz w:val="24"/>
+                <w:sz w:val="28"/>
               </w:rPr>
               <w:instrText xml:space="preserve"> PAGEREF bm_2_3 \h </w:instrText>
             </w:r>
             <w:r>
               <w:rPr>
                 <w:rFonts w:ascii="Times New Roman" w:hAnsi="Times New Roman" w:cs="Times New Roman" w:eastAsia="Times New Roman"/>
-                <w:sz w:val="24"/>
+                <w:sz w:val="28"/>
               </w:rPr>
               <w:fldChar w:fldCharType="separate"/>
             </w:r>
             <w:r>
               <w:rPr>
                 <w:rFonts w:ascii="Times New Roman" w:hAnsi="Times New Roman" w:cs="Times New Roman" w:eastAsia="Times New Roman"/>
-                <w:sz w:val="24"/>
-              </w:rPr>
-              <w:t xml:space="preserve"> </w:t>
-            </w:r>
-            <w:r>
-              <w:rPr>
-                <w:rFonts w:ascii="Times New Roman" w:hAnsi="Times New Roman" w:cs="Times New Roman" w:eastAsia="Times New Roman"/>
-                <w:sz w:val="24"/>
+                <w:sz w:val="28"/>
+              </w:rPr>
+              <w:t>7</w:t>
+            </w:r>
+            <w:r>
+              <w:rPr>
+                <w:rFonts w:ascii="Times New Roman" w:hAnsi="Times New Roman" w:cs="Times New Roman" w:eastAsia="Times New Roman"/>
+                <w:sz w:val="28"/>
               </w:rPr>
               <w:fldChar w:fldCharType="end"/>
             </w:r>
@@ -1835,35 +1840,35 @@
             <w:r>
               <w:rPr>
                 <w:rFonts w:ascii="Times New Roman" w:hAnsi="Times New Roman" w:cs="Times New Roman" w:eastAsia="Times New Roman"/>
-                <w:sz w:val="24"/>
+                <w:sz w:val="28"/>
               </w:rPr>
               <w:fldChar w:fldCharType="begin"/>
             </w:r>
             <w:r>
               <w:rPr>
                 <w:rFonts w:ascii="Times New Roman" w:hAnsi="Times New Roman" w:cs="Times New Roman" w:eastAsia="Times New Roman"/>
-                <w:sz w:val="24"/>
+                <w:sz w:val="28"/>
               </w:rPr>
               <w:instrText xml:space="preserve"> PAGEREF bm_2_4 \h </w:instrText>
             </w:r>
             <w:r>
               <w:rPr>
                 <w:rFonts w:ascii="Times New Roman" w:hAnsi="Times New Roman" w:cs="Times New Roman" w:eastAsia="Times New Roman"/>
-                <w:sz w:val="24"/>
+                <w:sz w:val="28"/>
               </w:rPr>
               <w:fldChar w:fldCharType="separate"/>
             </w:r>
             <w:r>
               <w:rPr>
                 <w:rFonts w:ascii="Times New Roman" w:hAnsi="Times New Roman" w:cs="Times New Roman" w:eastAsia="Times New Roman"/>
-                <w:sz w:val="24"/>
-              </w:rPr>
-              <w:t xml:space="preserve"> </w:t>
-            </w:r>
-            <w:r>
-              <w:rPr>
-                <w:rFonts w:ascii="Times New Roman" w:hAnsi="Times New Roman" w:cs="Times New Roman" w:eastAsia="Times New Roman"/>
-                <w:sz w:val="24"/>
+                <w:sz w:val="28"/>
+              </w:rPr>
+              <w:t>8</w:t>
+            </w:r>
+            <w:r>
+              <w:rPr>
+                <w:rFonts w:ascii="Times New Roman" w:hAnsi="Times New Roman" w:cs="Times New Roman" w:eastAsia="Times New Roman"/>
+                <w:sz w:val="28"/>
               </w:rPr>
               <w:fldChar w:fldCharType="end"/>
             </w:r>
@@ -1934,35 +1939,35 @@
             <w:r>
               <w:rPr>
                 <w:rFonts w:ascii="Times New Roman" w:hAnsi="Times New Roman" w:cs="Times New Roman" w:eastAsia="Times New Roman"/>
-                <w:sz w:val="24"/>
+                <w:sz w:val="28"/>
               </w:rPr>
               <w:fldChar w:fldCharType="begin"/>
             </w:r>
             <w:r>
               <w:rPr>
                 <w:rFonts w:ascii="Times New Roman" w:hAnsi="Times New Roman" w:cs="Times New Roman" w:eastAsia="Times New Roman"/>
-                <w:sz w:val="24"/>
+                <w:sz w:val="28"/>
               </w:rPr>
               <w:instrText xml:space="preserve"> PAGEREF bm_2_5 \h </w:instrText>
             </w:r>
             <w:r>
               <w:rPr>
                 <w:rFonts w:ascii="Times New Roman" w:hAnsi="Times New Roman" w:cs="Times New Roman" w:eastAsia="Times New Roman"/>
-                <w:sz w:val="24"/>
+                <w:sz w:val="28"/>
               </w:rPr>
               <w:fldChar w:fldCharType="separate"/>
             </w:r>
             <w:r>
               <w:rPr>
                 <w:rFonts w:ascii="Times New Roman" w:hAnsi="Times New Roman" w:cs="Times New Roman" w:eastAsia="Times New Roman"/>
-                <w:sz w:val="24"/>
-              </w:rPr>
-              <w:t xml:space="preserve"> </w:t>
-            </w:r>
-            <w:r>
-              <w:rPr>
-                <w:rFonts w:ascii="Times New Roman" w:hAnsi="Times New Roman" w:cs="Times New Roman" w:eastAsia="Times New Roman"/>
-                <w:sz w:val="24"/>
+                <w:sz w:val="28"/>
+              </w:rPr>
+              <w:t>9</w:t>
+            </w:r>
+            <w:r>
+              <w:rPr>
+                <w:rFonts w:ascii="Times New Roman" w:hAnsi="Times New Roman" w:cs="Times New Roman" w:eastAsia="Times New Roman"/>
+                <w:sz w:val="28"/>
               </w:rPr>
               <w:fldChar w:fldCharType="end"/>
             </w:r>
@@ -2033,35 +2038,35 @@
             <w:r>
               <w:rPr>
                 <w:rFonts w:ascii="Times New Roman" w:hAnsi="Times New Roman" w:cs="Times New Roman" w:eastAsia="Times New Roman"/>
-                <w:sz w:val="24"/>
+                <w:sz w:val="28"/>
               </w:rPr>
               <w:fldChar w:fldCharType="begin"/>
             </w:r>
             <w:r>
               <w:rPr>
                 <w:rFonts w:ascii="Times New Roman" w:hAnsi="Times New Roman" w:cs="Times New Roman" w:eastAsia="Times New Roman"/>
-                <w:sz w:val="24"/>
+                <w:sz w:val="28"/>
               </w:rPr>
               <w:instrText xml:space="preserve"> PAGEREF bm_2_6 \h </w:instrText>
             </w:r>
             <w:r>
               <w:rPr>
                 <w:rFonts w:ascii="Times New Roman" w:hAnsi="Times New Roman" w:cs="Times New Roman" w:eastAsia="Times New Roman"/>
-                <w:sz w:val="24"/>
+                <w:sz w:val="28"/>
               </w:rPr>
               <w:fldChar w:fldCharType="separate"/>
             </w:r>
             <w:r>
               <w:rPr>
                 <w:rFonts w:ascii="Times New Roman" w:hAnsi="Times New Roman" w:cs="Times New Roman" w:eastAsia="Times New Roman"/>
-                <w:sz w:val="24"/>
-              </w:rPr>
-              <w:t xml:space="preserve"> </w:t>
-            </w:r>
-            <w:r>
-              <w:rPr>
-                <w:rFonts w:ascii="Times New Roman" w:hAnsi="Times New Roman" w:cs="Times New Roman" w:eastAsia="Times New Roman"/>
-                <w:sz w:val="24"/>
+                <w:sz w:val="28"/>
+              </w:rPr>
+              <w:t>9</w:t>
+            </w:r>
+            <w:r>
+              <w:rPr>
+                <w:rFonts w:ascii="Times New Roman" w:hAnsi="Times New Roman" w:cs="Times New Roman" w:eastAsia="Times New Roman"/>
+                <w:sz w:val="28"/>
               </w:rPr>
               <w:fldChar w:fldCharType="end"/>
             </w:r>
@@ -2132,35 +2137,35 @@
             <w:r>
               <w:rPr>
                 <w:rFonts w:ascii="Times New Roman" w:hAnsi="Times New Roman" w:cs="Times New Roman" w:eastAsia="Times New Roman"/>
-                <w:sz w:val="24"/>
+                <w:sz w:val="28"/>
               </w:rPr>
               <w:fldChar w:fldCharType="begin"/>
             </w:r>
             <w:r>
               <w:rPr>
                 <w:rFonts w:ascii="Times New Roman" w:hAnsi="Times New Roman" w:cs="Times New Roman" w:eastAsia="Times New Roman"/>
-                <w:sz w:val="24"/>
+                <w:sz w:val="28"/>
               </w:rPr>
               <w:instrText xml:space="preserve"> PAGEREF bm_2_7 \h </w:instrText>
             </w:r>
             <w:r>
               <w:rPr>
                 <w:rFonts w:ascii="Times New Roman" w:hAnsi="Times New Roman" w:cs="Times New Roman" w:eastAsia="Times New Roman"/>
-                <w:sz w:val="24"/>
+                <w:sz w:val="28"/>
               </w:rPr>
               <w:fldChar w:fldCharType="separate"/>
             </w:r>
             <w:r>
               <w:rPr>
                 <w:rFonts w:ascii="Times New Roman" w:hAnsi="Times New Roman" w:cs="Times New Roman" w:eastAsia="Times New Roman"/>
-                <w:sz w:val="24"/>
-              </w:rPr>
-              <w:t xml:space="preserve"> </w:t>
-            </w:r>
-            <w:r>
-              <w:rPr>
-                <w:rFonts w:ascii="Times New Roman" w:hAnsi="Times New Roman" w:cs="Times New Roman" w:eastAsia="Times New Roman"/>
-                <w:sz w:val="24"/>
+                <w:sz w:val="28"/>
+              </w:rPr>
+              <w:t>10</w:t>
+            </w:r>
+            <w:r>
+              <w:rPr>
+                <w:rFonts w:ascii="Times New Roman" w:hAnsi="Times New Roman" w:cs="Times New Roman" w:eastAsia="Times New Roman"/>
+                <w:sz w:val="28"/>
               </w:rPr>
               <w:fldChar w:fldCharType="end"/>
             </w:r>
@@ -2231,35 +2236,35 @@
             <w:r>
               <w:rPr>
                 <w:rFonts w:ascii="Times New Roman" w:hAnsi="Times New Roman" w:cs="Times New Roman" w:eastAsia="Times New Roman"/>
-                <w:sz w:val="24"/>
+                <w:sz w:val="28"/>
               </w:rPr>
               <w:fldChar w:fldCharType="begin"/>
             </w:r>
             <w:r>
               <w:rPr>
                 <w:rFonts w:ascii="Times New Roman" w:hAnsi="Times New Roman" w:cs="Times New Roman" w:eastAsia="Times New Roman"/>
-                <w:sz w:val="24"/>
+                <w:sz w:val="28"/>
               </w:rPr>
               <w:instrText xml:space="preserve"> PAGEREF bm_2_8 \h </w:instrText>
             </w:r>
             <w:r>
               <w:rPr>
                 <w:rFonts w:ascii="Times New Roman" w:hAnsi="Times New Roman" w:cs="Times New Roman" w:eastAsia="Times New Roman"/>
-                <w:sz w:val="24"/>
+                <w:sz w:val="28"/>
               </w:rPr>
               <w:fldChar w:fldCharType="separate"/>
             </w:r>
             <w:r>
               <w:rPr>
                 <w:rFonts w:ascii="Times New Roman" w:hAnsi="Times New Roman" w:cs="Times New Roman" w:eastAsia="Times New Roman"/>
-                <w:sz w:val="24"/>
-              </w:rPr>
-              <w:t xml:space="preserve"> </w:t>
-            </w:r>
-            <w:r>
-              <w:rPr>
-                <w:rFonts w:ascii="Times New Roman" w:hAnsi="Times New Roman" w:cs="Times New Roman" w:eastAsia="Times New Roman"/>
-                <w:sz w:val="24"/>
+                <w:sz w:val="28"/>
+              </w:rPr>
+              <w:t>11</w:t>
+            </w:r>
+            <w:r>
+              <w:rPr>
+                <w:rFonts w:ascii="Times New Roman" w:hAnsi="Times New Roman" w:cs="Times New Roman" w:eastAsia="Times New Roman"/>
+                <w:sz w:val="28"/>
               </w:rPr>
               <w:fldChar w:fldCharType="end"/>
             </w:r>
@@ -2338,35 +2343,35 @@
             <w:r>
               <w:rPr>
                 <w:rFonts w:ascii="Times New Roman" w:hAnsi="Times New Roman" w:cs="Times New Roman" w:eastAsia="Times New Roman"/>
-                <w:sz w:val="24"/>
+                <w:sz w:val="28"/>
               </w:rPr>
               <w:fldChar w:fldCharType="begin"/>
             </w:r>
             <w:r>
               <w:rPr>
                 <w:rFonts w:ascii="Times New Roman" w:hAnsi="Times New Roman" w:cs="Times New Roman" w:eastAsia="Times New Roman"/>
-                <w:sz w:val="24"/>
+                <w:sz w:val="28"/>
               </w:rPr>
               <w:instrText xml:space="preserve"> PAGEREF bm_3 \h </w:instrText>
             </w:r>
             <w:r>
               <w:rPr>
                 <w:rFonts w:ascii="Times New Roman" w:hAnsi="Times New Roman" w:cs="Times New Roman" w:eastAsia="Times New Roman"/>
-                <w:sz w:val="24"/>
+                <w:sz w:val="28"/>
               </w:rPr>
               <w:fldChar w:fldCharType="separate"/>
             </w:r>
             <w:r>
               <w:rPr>
                 <w:rFonts w:ascii="Times New Roman" w:hAnsi="Times New Roman" w:cs="Times New Roman" w:eastAsia="Times New Roman"/>
-                <w:sz w:val="24"/>
-              </w:rPr>
-              <w:t xml:space="preserve"> </w:t>
-            </w:r>
-            <w:r>
-              <w:rPr>
-                <w:rFonts w:ascii="Times New Roman" w:hAnsi="Times New Roman" w:cs="Times New Roman" w:eastAsia="Times New Roman"/>
-                <w:sz w:val="24"/>
+                <w:sz w:val="28"/>
+              </w:rPr>
+              <w:t>12</w:t>
+            </w:r>
+            <w:r>
+              <w:rPr>
+                <w:rFonts w:ascii="Times New Roman" w:hAnsi="Times New Roman" w:cs="Times New Roman" w:eastAsia="Times New Roman"/>
+                <w:sz w:val="28"/>
               </w:rPr>
               <w:fldChar w:fldCharType="end"/>
             </w:r>
@@ -2429,35 +2434,35 @@
             <w:r>
               <w:rPr>
                 <w:rFonts w:ascii="Times New Roman" w:hAnsi="Times New Roman" w:cs="Times New Roman" w:eastAsia="Times New Roman"/>
-                <w:sz w:val="24"/>
+                <w:sz w:val="28"/>
               </w:rPr>
               <w:fldChar w:fldCharType="begin"/>
             </w:r>
             <w:r>
               <w:rPr>
                 <w:rFonts w:ascii="Times New Roman" w:hAnsi="Times New Roman" w:cs="Times New Roman" w:eastAsia="Times New Roman"/>
-                <w:sz w:val="24"/>
+                <w:sz w:val="28"/>
               </w:rPr>
               <w:instrText xml:space="preserve"> PAGEREF bm_3_1 \h </w:instrText>
             </w:r>
             <w:r>
               <w:rPr>
                 <w:rFonts w:ascii="Times New Roman" w:hAnsi="Times New Roman" w:cs="Times New Roman" w:eastAsia="Times New Roman"/>
-                <w:sz w:val="24"/>
+                <w:sz w:val="28"/>
               </w:rPr>
               <w:fldChar w:fldCharType="separate"/>
             </w:r>
             <w:r>
               <w:rPr>
                 <w:rFonts w:ascii="Times New Roman" w:hAnsi="Times New Roman" w:cs="Times New Roman" w:eastAsia="Times New Roman"/>
-                <w:sz w:val="24"/>
-              </w:rPr>
-              <w:t xml:space="preserve"> </w:t>
-            </w:r>
-            <w:r>
-              <w:rPr>
-                <w:rFonts w:ascii="Times New Roman" w:hAnsi="Times New Roman" w:cs="Times New Roman" w:eastAsia="Times New Roman"/>
-                <w:sz w:val="24"/>
+                <w:sz w:val="28"/>
+              </w:rPr>
+              <w:t>12</w:t>
+            </w:r>
+            <w:r>
+              <w:rPr>
+                <w:rFonts w:ascii="Times New Roman" w:hAnsi="Times New Roman" w:cs="Times New Roman" w:eastAsia="Times New Roman"/>
+                <w:sz w:val="28"/>
               </w:rPr>
               <w:fldChar w:fldCharType="end"/>
             </w:r>
@@ -2520,35 +2525,35 @@
             <w:r>
               <w:rPr>
                 <w:rFonts w:ascii="Times New Roman" w:hAnsi="Times New Roman" w:cs="Times New Roman" w:eastAsia="Times New Roman"/>
-                <w:sz w:val="24"/>
+                <w:sz w:val="28"/>
               </w:rPr>
               <w:fldChar w:fldCharType="begin"/>
             </w:r>
             <w:r>
               <w:rPr>
                 <w:rFonts w:ascii="Times New Roman" w:hAnsi="Times New Roman" w:cs="Times New Roman" w:eastAsia="Times New Roman"/>
-                <w:sz w:val="24"/>
+                <w:sz w:val="28"/>
               </w:rPr>
               <w:instrText xml:space="preserve"> PAGEREF bm_3_2 \h </w:instrText>
             </w:r>
             <w:r>
               <w:rPr>
                 <w:rFonts w:ascii="Times New Roman" w:hAnsi="Times New Roman" w:cs="Times New Roman" w:eastAsia="Times New Roman"/>
-                <w:sz w:val="24"/>
+                <w:sz w:val="28"/>
               </w:rPr>
               <w:fldChar w:fldCharType="separate"/>
             </w:r>
             <w:r>
               <w:rPr>
                 <w:rFonts w:ascii="Times New Roman" w:hAnsi="Times New Roman" w:cs="Times New Roman" w:eastAsia="Times New Roman"/>
-                <w:sz w:val="24"/>
-              </w:rPr>
-              <w:t xml:space="preserve"> </w:t>
-            </w:r>
-            <w:r>
-              <w:rPr>
-                <w:rFonts w:ascii="Times New Roman" w:hAnsi="Times New Roman" w:cs="Times New Roman" w:eastAsia="Times New Roman"/>
-                <w:sz w:val="24"/>
+                <w:sz w:val="28"/>
+              </w:rPr>
+              <w:t>13</w:t>
+            </w:r>
+            <w:r>
+              <w:rPr>
+                <w:rFonts w:ascii="Times New Roman" w:hAnsi="Times New Roman" w:cs="Times New Roman" w:eastAsia="Times New Roman"/>
+                <w:sz w:val="28"/>
               </w:rPr>
               <w:fldChar w:fldCharType="end"/>
             </w:r>
@@ -2611,35 +2616,35 @@
             <w:r>
               <w:rPr>
                 <w:rFonts w:ascii="Times New Roman" w:hAnsi="Times New Roman" w:cs="Times New Roman" w:eastAsia="Times New Roman"/>
-                <w:sz w:val="24"/>
+                <w:sz w:val="28"/>
               </w:rPr>
               <w:fldChar w:fldCharType="begin"/>
             </w:r>
             <w:r>
               <w:rPr>
                 <w:rFonts w:ascii="Times New Roman" w:hAnsi="Times New Roman" w:cs="Times New Roman" w:eastAsia="Times New Roman"/>
-                <w:sz w:val="24"/>
+                <w:sz w:val="28"/>
               </w:rPr>
               <w:instrText xml:space="preserve"> PAGEREF bm_3_3 \h </w:instrText>
             </w:r>
             <w:r>
               <w:rPr>
                 <w:rFonts w:ascii="Times New Roman" w:hAnsi="Times New Roman" w:cs="Times New Roman" w:eastAsia="Times New Roman"/>
-                <w:sz w:val="24"/>
+                <w:sz w:val="28"/>
               </w:rPr>
               <w:fldChar w:fldCharType="separate"/>
             </w:r>
             <w:r>
               <w:rPr>
                 <w:rFonts w:ascii="Times New Roman" w:hAnsi="Times New Roman" w:cs="Times New Roman" w:eastAsia="Times New Roman"/>
-                <w:sz w:val="24"/>
-              </w:rPr>
-              <w:t xml:space="preserve"> </w:t>
-            </w:r>
-            <w:r>
-              <w:rPr>
-                <w:rFonts w:ascii="Times New Roman" w:hAnsi="Times New Roman" w:cs="Times New Roman" w:eastAsia="Times New Roman"/>
-                <w:sz w:val="24"/>
+                <w:sz w:val="28"/>
+              </w:rPr>
+              <w:t>14</w:t>
+            </w:r>
+            <w:r>
+              <w:rPr>
+                <w:rFonts w:ascii="Times New Roman" w:hAnsi="Times New Roman" w:cs="Times New Roman" w:eastAsia="Times New Roman"/>
+                <w:sz w:val="28"/>
               </w:rPr>
               <w:fldChar w:fldCharType="end"/>
             </w:r>
@@ -2710,35 +2715,35 @@
             <w:r>
               <w:rPr>
                 <w:rFonts w:ascii="Times New Roman" w:hAnsi="Times New Roman" w:cs="Times New Roman" w:eastAsia="Times New Roman"/>
-                <w:sz w:val="24"/>
+                <w:sz w:val="28"/>
               </w:rPr>
               <w:fldChar w:fldCharType="begin"/>
             </w:r>
             <w:r>
               <w:rPr>
                 <w:rFonts w:ascii="Times New Roman" w:hAnsi="Times New Roman" w:cs="Times New Roman" w:eastAsia="Times New Roman"/>
-                <w:sz w:val="24"/>
+                <w:sz w:val="28"/>
               </w:rPr>
               <w:instrText xml:space="preserve"> PAGEREF bm_3_4 \h </w:instrText>
             </w:r>
             <w:r>
               <w:rPr>
                 <w:rFonts w:ascii="Times New Roman" w:hAnsi="Times New Roman" w:cs="Times New Roman" w:eastAsia="Times New Roman"/>
-                <w:sz w:val="24"/>
+                <w:sz w:val="28"/>
               </w:rPr>
               <w:fldChar w:fldCharType="separate"/>
             </w:r>
             <w:r>
               <w:rPr>
                 <w:rFonts w:ascii="Times New Roman" w:hAnsi="Times New Roman" w:cs="Times New Roman" w:eastAsia="Times New Roman"/>
-                <w:sz w:val="24"/>
-              </w:rPr>
-              <w:t xml:space="preserve"> </w:t>
-            </w:r>
-            <w:r>
-              <w:rPr>
-                <w:rFonts w:ascii="Times New Roman" w:hAnsi="Times New Roman" w:cs="Times New Roman" w:eastAsia="Times New Roman"/>
-                <w:sz w:val="24"/>
+                <w:sz w:val="28"/>
+              </w:rPr>
+              <w:t>14</w:t>
+            </w:r>
+            <w:r>
+              <w:rPr>
+                <w:rFonts w:ascii="Times New Roman" w:hAnsi="Times New Roman" w:cs="Times New Roman" w:eastAsia="Times New Roman"/>
+                <w:sz w:val="28"/>
               </w:rPr>
               <w:fldChar w:fldCharType="end"/>
             </w:r>
@@ -2809,35 +2814,35 @@
             <w:r>
               <w:rPr>
                 <w:rFonts w:ascii="Times New Roman" w:hAnsi="Times New Roman" w:cs="Times New Roman" w:eastAsia="Times New Roman"/>
-                <w:sz w:val="24"/>
+                <w:sz w:val="28"/>
               </w:rPr>
               <w:fldChar w:fldCharType="begin"/>
             </w:r>
             <w:r>
               <w:rPr>
                 <w:rFonts w:ascii="Times New Roman" w:hAnsi="Times New Roman" w:cs="Times New Roman" w:eastAsia="Times New Roman"/>
-                <w:sz w:val="24"/>
+                <w:sz w:val="28"/>
               </w:rPr>
               <w:instrText xml:space="preserve"> PAGEREF bm_4 \h </w:instrText>
             </w:r>
             <w:r>
               <w:rPr>
                 <w:rFonts w:ascii="Times New Roman" w:hAnsi="Times New Roman" w:cs="Times New Roman" w:eastAsia="Times New Roman"/>
-                <w:sz w:val="24"/>
+                <w:sz w:val="28"/>
               </w:rPr>
               <w:fldChar w:fldCharType="separate"/>
             </w:r>
             <w:r>
               <w:rPr>
                 <w:rFonts w:ascii="Times New Roman" w:hAnsi="Times New Roman" w:cs="Times New Roman" w:eastAsia="Times New Roman"/>
-                <w:sz w:val="24"/>
-              </w:rPr>
-              <w:t xml:space="preserve"> </w:t>
-            </w:r>
-            <w:r>
-              <w:rPr>
-                <w:rFonts w:ascii="Times New Roman" w:hAnsi="Times New Roman" w:cs="Times New Roman" w:eastAsia="Times New Roman"/>
-                <w:sz w:val="24"/>
+                <w:sz w:val="28"/>
+              </w:rPr>
+              <w:t>15</w:t>
+            </w:r>
+            <w:r>
+              <w:rPr>
+                <w:rFonts w:ascii="Times New Roman" w:hAnsi="Times New Roman" w:cs="Times New Roman" w:eastAsia="Times New Roman"/>
+                <w:sz w:val="28"/>
               </w:rPr>
               <w:fldChar w:fldCharType="end"/>
             </w:r>
@@ -2900,35 +2905,35 @@
             <w:r>
               <w:rPr>
                 <w:rFonts w:ascii="Times New Roman" w:hAnsi="Times New Roman" w:cs="Times New Roman" w:eastAsia="Times New Roman"/>
-                <w:sz w:val="24"/>
+                <w:sz w:val="28"/>
               </w:rPr>
               <w:fldChar w:fldCharType="begin"/>
             </w:r>
             <w:r>
               <w:rPr>
                 <w:rFonts w:ascii="Times New Roman" w:hAnsi="Times New Roman" w:cs="Times New Roman" w:eastAsia="Times New Roman"/>
-                <w:sz w:val="24"/>
+                <w:sz w:val="28"/>
               </w:rPr>
               <w:instrText xml:space="preserve"> PAGEREF bm_4_1 \h </w:instrText>
             </w:r>
             <w:r>
               <w:rPr>
                 <w:rFonts w:ascii="Times New Roman" w:hAnsi="Times New Roman" w:cs="Times New Roman" w:eastAsia="Times New Roman"/>
-                <w:sz w:val="24"/>
+                <w:sz w:val="28"/>
               </w:rPr>
               <w:fldChar w:fldCharType="separate"/>
             </w:r>
             <w:r>
               <w:rPr>
                 <w:rFonts w:ascii="Times New Roman" w:hAnsi="Times New Roman" w:cs="Times New Roman" w:eastAsia="Times New Roman"/>
-                <w:sz w:val="24"/>
-              </w:rPr>
-              <w:t xml:space="preserve"> </w:t>
-            </w:r>
-            <w:r>
-              <w:rPr>
-                <w:rFonts w:ascii="Times New Roman" w:hAnsi="Times New Roman" w:cs="Times New Roman" w:eastAsia="Times New Roman"/>
-                <w:sz w:val="24"/>
+                <w:sz w:val="28"/>
+              </w:rPr>
+              <w:t>15</w:t>
+            </w:r>
+            <w:r>
+              <w:rPr>
+                <w:rFonts w:ascii="Times New Roman" w:hAnsi="Times New Roman" w:cs="Times New Roman" w:eastAsia="Times New Roman"/>
+                <w:sz w:val="28"/>
               </w:rPr>
               <w:fldChar w:fldCharType="end"/>
             </w:r>
@@ -2991,35 +2996,35 @@
             <w:r>
               <w:rPr>
                 <w:rFonts w:ascii="Times New Roman" w:hAnsi="Times New Roman" w:cs="Times New Roman" w:eastAsia="Times New Roman"/>
-                <w:sz w:val="24"/>
+                <w:sz w:val="28"/>
               </w:rPr>
               <w:fldChar w:fldCharType="begin"/>
             </w:r>
             <w:r>
               <w:rPr>
                 <w:rFonts w:ascii="Times New Roman" w:hAnsi="Times New Roman" w:cs="Times New Roman" w:eastAsia="Times New Roman"/>
-                <w:sz w:val="24"/>
+                <w:sz w:val="28"/>
               </w:rPr>
               <w:instrText xml:space="preserve"> PAGEREF bm_4_2 \h </w:instrText>
             </w:r>
             <w:r>
               <w:rPr>
                 <w:rFonts w:ascii="Times New Roman" w:hAnsi="Times New Roman" w:cs="Times New Roman" w:eastAsia="Times New Roman"/>
-                <w:sz w:val="24"/>
+                <w:sz w:val="28"/>
               </w:rPr>
               <w:fldChar w:fldCharType="separate"/>
             </w:r>
             <w:r>
               <w:rPr>
                 <w:rFonts w:ascii="Times New Roman" w:hAnsi="Times New Roman" w:cs="Times New Roman" w:eastAsia="Times New Roman"/>
-                <w:sz w:val="24"/>
-              </w:rPr>
-              <w:t xml:space="preserve"> </w:t>
-            </w:r>
-            <w:r>
-              <w:rPr>
-                <w:rFonts w:ascii="Times New Roman" w:hAnsi="Times New Roman" w:cs="Times New Roman" w:eastAsia="Times New Roman"/>
-                <w:sz w:val="24"/>
+                <w:sz w:val="28"/>
+              </w:rPr>
+              <w:t>15</w:t>
+            </w:r>
+            <w:r>
+              <w:rPr>
+                <w:rFonts w:ascii="Times New Roman" w:hAnsi="Times New Roman" w:cs="Times New Roman" w:eastAsia="Times New Roman"/>
+                <w:sz w:val="28"/>
               </w:rPr>
               <w:fldChar w:fldCharType="end"/>
             </w:r>
@@ -3082,35 +3087,35 @@
             <w:r>
               <w:rPr>
                 <w:rFonts w:ascii="Times New Roman" w:hAnsi="Times New Roman" w:cs="Times New Roman" w:eastAsia="Times New Roman"/>
-                <w:sz w:val="24"/>
+                <w:sz w:val="28"/>
               </w:rPr>
               <w:fldChar w:fldCharType="begin"/>
             </w:r>
             <w:r>
               <w:rPr>
                 <w:rFonts w:ascii="Times New Roman" w:hAnsi="Times New Roman" w:cs="Times New Roman" w:eastAsia="Times New Roman"/>
-                <w:sz w:val="24"/>
+                <w:sz w:val="28"/>
               </w:rPr>
               <w:instrText xml:space="preserve"> PAGEREF bm_4_3 \h </w:instrText>
             </w:r>
             <w:r>
               <w:rPr>
                 <w:rFonts w:ascii="Times New Roman" w:hAnsi="Times New Roman" w:cs="Times New Roman" w:eastAsia="Times New Roman"/>
-                <w:sz w:val="24"/>
+                <w:sz w:val="28"/>
               </w:rPr>
               <w:fldChar w:fldCharType="separate"/>
             </w:r>
             <w:r>
               <w:rPr>
                 <w:rFonts w:ascii="Times New Roman" w:hAnsi="Times New Roman" w:cs="Times New Roman" w:eastAsia="Times New Roman"/>
-                <w:sz w:val="24"/>
-              </w:rPr>
-              <w:t xml:space="preserve"> </w:t>
-            </w:r>
-            <w:r>
-              <w:rPr>
-                <w:rFonts w:ascii="Times New Roman" w:hAnsi="Times New Roman" w:cs="Times New Roman" w:eastAsia="Times New Roman"/>
-                <w:sz w:val="24"/>
+                <w:sz w:val="28"/>
+              </w:rPr>
+              <w:t>15</w:t>
+            </w:r>
+            <w:r>
+              <w:rPr>
+                <w:rFonts w:ascii="Times New Roman" w:hAnsi="Times New Roman" w:cs="Times New Roman" w:eastAsia="Times New Roman"/>
+                <w:sz w:val="28"/>
               </w:rPr>
               <w:fldChar w:fldCharType="end"/>
             </w:r>
@@ -3181,35 +3186,35 @@
             <w:r>
               <w:rPr>
                 <w:rFonts w:ascii="Times New Roman" w:hAnsi="Times New Roman" w:cs="Times New Roman" w:eastAsia="Times New Roman"/>
-                <w:sz w:val="24"/>
+                <w:sz w:val="28"/>
               </w:rPr>
               <w:fldChar w:fldCharType="begin"/>
             </w:r>
             <w:r>
               <w:rPr>
                 <w:rFonts w:ascii="Times New Roman" w:hAnsi="Times New Roman" w:cs="Times New Roman" w:eastAsia="Times New Roman"/>
-                <w:sz w:val="24"/>
+                <w:sz w:val="28"/>
               </w:rPr>
               <w:instrText xml:space="preserve"> PAGEREF bm_5 \h </w:instrText>
             </w:r>
             <w:r>
               <w:rPr>
                 <w:rFonts w:ascii="Times New Roman" w:hAnsi="Times New Roman" w:cs="Times New Roman" w:eastAsia="Times New Roman"/>
-                <w:sz w:val="24"/>
+                <w:sz w:val="28"/>
               </w:rPr>
               <w:fldChar w:fldCharType="separate"/>
             </w:r>
             <w:r>
               <w:rPr>
                 <w:rFonts w:ascii="Times New Roman" w:hAnsi="Times New Roman" w:cs="Times New Roman" w:eastAsia="Times New Roman"/>
-                <w:sz w:val="24"/>
-              </w:rPr>
-              <w:t xml:space="preserve"> </w:t>
-            </w:r>
-            <w:r>
-              <w:rPr>
-                <w:rFonts w:ascii="Times New Roman" w:hAnsi="Times New Roman" w:cs="Times New Roman" w:eastAsia="Times New Roman"/>
-                <w:sz w:val="24"/>
+                <w:sz w:val="28"/>
+              </w:rPr>
+              <w:t>16</w:t>
+            </w:r>
+            <w:r>
+              <w:rPr>
+                <w:rFonts w:ascii="Times New Roman" w:hAnsi="Times New Roman" w:cs="Times New Roman" w:eastAsia="Times New Roman"/>
+                <w:sz w:val="28"/>
               </w:rPr>
               <w:fldChar w:fldCharType="end"/>
             </w:r>
@@ -3258,35 +3263,35 @@
             <w:r>
               <w:rPr>
                 <w:rFonts w:ascii="Times New Roman" w:hAnsi="Times New Roman" w:cs="Times New Roman" w:eastAsia="Times New Roman"/>
-                <w:sz w:val="24"/>
+                <w:sz w:val="28"/>
               </w:rPr>
               <w:fldChar w:fldCharType="begin"/>
             </w:r>
             <w:r>
               <w:rPr>
                 <w:rFonts w:ascii="Times New Roman" w:hAnsi="Times New Roman" w:cs="Times New Roman" w:eastAsia="Times New Roman"/>
-                <w:sz w:val="24"/>
+                <w:sz w:val="28"/>
               </w:rPr>
               <w:instrText xml:space="preserve"> PAGEREF bm_A \h </w:instrText>
             </w:r>
             <w:r>
               <w:rPr>
                 <w:rFonts w:ascii="Times New Roman" w:hAnsi="Times New Roman" w:cs="Times New Roman" w:eastAsia="Times New Roman"/>
-                <w:sz w:val="24"/>
+                <w:sz w:val="28"/>
               </w:rPr>
               <w:fldChar w:fldCharType="separate"/>
             </w:r>
             <w:r>
               <w:rPr>
                 <w:rFonts w:ascii="Times New Roman" w:hAnsi="Times New Roman" w:cs="Times New Roman" w:eastAsia="Times New Roman"/>
-                <w:sz w:val="24"/>
-              </w:rPr>
-              <w:t xml:space="preserve"> </w:t>
-            </w:r>
-            <w:r>
-              <w:rPr>
-                <w:rFonts w:ascii="Times New Roman" w:hAnsi="Times New Roman" w:cs="Times New Roman" w:eastAsia="Times New Roman"/>
-                <w:sz w:val="24"/>
+                <w:sz w:val="28"/>
+              </w:rPr>
+              <w:t>17</w:t>
+            </w:r>
+            <w:r>
+              <w:rPr>
+                <w:rFonts w:ascii="Times New Roman" w:hAnsi="Times New Roman" w:cs="Times New Roman" w:eastAsia="Times New Roman"/>
+                <w:sz w:val="28"/>
               </w:rPr>
               <w:fldChar w:fldCharType="end"/>
             </w:r>
@@ -3335,35 +3340,35 @@
             <w:r>
               <w:rPr>
                 <w:rFonts w:ascii="Times New Roman" w:hAnsi="Times New Roman" w:cs="Times New Roman" w:eastAsia="Times New Roman"/>
-                <w:sz w:val="24"/>
+                <w:sz w:val="28"/>
               </w:rPr>
               <w:fldChar w:fldCharType="begin"/>
             </w:r>
             <w:r>
               <w:rPr>
                 <w:rFonts w:ascii="Times New Roman" w:hAnsi="Times New Roman" w:cs="Times New Roman" w:eastAsia="Times New Roman"/>
-                <w:sz w:val="24"/>
+                <w:sz w:val="28"/>
               </w:rPr>
               <w:instrText xml:space="preserve"> PAGEREF bm_B \h </w:instrText>
             </w:r>
             <w:r>
               <w:rPr>
                 <w:rFonts w:ascii="Times New Roman" w:hAnsi="Times New Roman" w:cs="Times New Roman" w:eastAsia="Times New Roman"/>
-                <w:sz w:val="24"/>
+                <w:sz w:val="28"/>
               </w:rPr>
               <w:fldChar w:fldCharType="separate"/>
             </w:r>
             <w:r>
               <w:rPr>
                 <w:rFonts w:ascii="Times New Roman" w:hAnsi="Times New Roman" w:cs="Times New Roman" w:eastAsia="Times New Roman"/>
-                <w:sz w:val="24"/>
-              </w:rPr>
-              <w:t xml:space="preserve"> </w:t>
-            </w:r>
-            <w:r>
-              <w:rPr>
-                <w:rFonts w:ascii="Times New Roman" w:hAnsi="Times New Roman" w:cs="Times New Roman" w:eastAsia="Times New Roman"/>
-                <w:sz w:val="24"/>
+                <w:sz w:val="28"/>
+              </w:rPr>
+              <w:t>18</w:t>
+            </w:r>
+            <w:r>
+              <w:rPr>
+                <w:rFonts w:ascii="Times New Roman" w:hAnsi="Times New Roman" w:cs="Times New Roman" w:eastAsia="Times New Roman"/>
+                <w:sz w:val="28"/>
               </w:rPr>
               <w:fldChar w:fldCharType="end"/>
             </w:r>
@@ -3412,35 +3417,35 @@
             <w:r>
               <w:rPr>
                 <w:rFonts w:ascii="Times New Roman" w:hAnsi="Times New Roman" w:cs="Times New Roman" w:eastAsia="Times New Roman"/>
-                <w:sz w:val="24"/>
+                <w:sz w:val="28"/>
               </w:rPr>
               <w:fldChar w:fldCharType="begin"/>
             </w:r>
             <w:r>
               <w:rPr>
                 <w:rFonts w:ascii="Times New Roman" w:hAnsi="Times New Roman" w:cs="Times New Roman" w:eastAsia="Times New Roman"/>
-                <w:sz w:val="24"/>
+                <w:sz w:val="28"/>
               </w:rPr>
               <w:instrText xml:space="preserve"> PAGEREF bm_C \h </w:instrText>
             </w:r>
             <w:r>
               <w:rPr>
                 <w:rFonts w:ascii="Times New Roman" w:hAnsi="Times New Roman" w:cs="Times New Roman" w:eastAsia="Times New Roman"/>
-                <w:sz w:val="24"/>
+                <w:sz w:val="28"/>
               </w:rPr>
               <w:fldChar w:fldCharType="separate"/>
             </w:r>
             <w:r>
               <w:rPr>
                 <w:rFonts w:ascii="Times New Roman" w:hAnsi="Times New Roman" w:cs="Times New Roman" w:eastAsia="Times New Roman"/>
-                <w:sz w:val="24"/>
-              </w:rPr>
-              <w:t xml:space="preserve"> </w:t>
-            </w:r>
-            <w:r>
-              <w:rPr>
-                <w:rFonts w:ascii="Times New Roman" w:hAnsi="Times New Roman" w:cs="Times New Roman" w:eastAsia="Times New Roman"/>
-                <w:sz w:val="24"/>
+                <w:sz w:val="28"/>
+              </w:rPr>
+              <w:t>19</w:t>
+            </w:r>
+            <w:r>
+              <w:rPr>
+                <w:rFonts w:ascii="Times New Roman" w:hAnsi="Times New Roman" w:cs="Times New Roman" w:eastAsia="Times New Roman"/>
+                <w:sz w:val="28"/>
               </w:rPr>
               <w:fldChar w:fldCharType="end"/>
             </w:r>
@@ -3451,66 +3456,9 @@
     <w:p xmlns:wp14="http://schemas.microsoft.com/office/word/2010/wordml" wp14:textId="77777777">
       <w:pPr>
         <w:pStyle w:val="NoSpacing"/>
-        <w:jc w:val="center"/>
-        <w:rPr>
-          <w:sz w:val="40"/>
-          <w:szCs w:val="40"/>
-        </w:rPr>
-      </w:pPr>
-    </w:p>
-    <w:p xmlns:wp14="http://schemas.microsoft.com/office/word/2010/wordml" wp14:textId="77777777">
-      <w:pPr>
-        <w:pStyle w:val="NoSpacing"/>
-        <w:jc w:val="center"/>
-        <w:rPr>
-          <w:sz w:val="40"/>
-          <w:szCs w:val="40"/>
-        </w:rPr>
-      </w:pPr>
-    </w:p>
-    <w:p xmlns:wp14="http://schemas.microsoft.com/office/word/2010/wordml" wp14:textId="77777777">
-      <w:pPr>
-        <w:pStyle w:val="NoSpacing"/>
-        <w:jc w:val="center"/>
-        <w:rPr>
-          <w:sz w:val="40"/>
-          <w:szCs w:val="40"/>
-        </w:rPr>
-      </w:pPr>
-    </w:p>
-    <w:p xmlns:wp14="http://schemas.microsoft.com/office/word/2010/wordml" wp14:textId="77777777">
-      <w:pPr>
-        <w:pStyle w:val="NoSpacing"/>
-        <w:jc w:val="center"/>
-        <w:rPr>
-          <w:sz w:val="40"/>
-          <w:szCs w:val="40"/>
-        </w:rPr>
-      </w:pPr>
-    </w:p>
-    <w:p xmlns:wp14="http://schemas.microsoft.com/office/word/2010/wordml" wp14:textId="77777777">
-      <w:pPr>
-        <w:pStyle w:val="NoSpacing"/>
-        <w:jc w:val="center"/>
-        <w:rPr>
-          <w:sz w:val="40"/>
-          <w:szCs w:val="40"/>
-        </w:rPr>
-      </w:pPr>
-    </w:p>
-    <w:p xmlns:wp14="http://schemas.microsoft.com/office/word/2010/wordml" wp14:textId="77777777">
-      <w:pPr>
-        <w:pStyle w:val="NoSpacing"/>
-        <w:jc w:val="center"/>
-        <w:rPr>
-          <w:sz w:val="40"/>
-          <w:szCs w:val="40"/>
-        </w:rPr>
-      </w:pPr>
-    </w:p>
-    <w:p xmlns:wp14="http://schemas.microsoft.com/office/word/2010/wordml" wp14:textId="77777777">
-      <w:pPr>
-        <w:pStyle w:val="NoSpacing"/>
+        <w:keepNext/>
+        <w:pageBreakBefore/>
+        <w:spacing w:before="0" w:after="240"/>
         <w:jc w:val="center"/>
         <w:rPr>
           <w:b/>
@@ -3522,6 +3470,7 @@
       <w:bookmarkStart w:id="102" w:name="bm_rev"/>
       <w:r>
         <w:rPr>
+          <w:rFonts w:ascii="Times New Roman" w:hAnsi="Times New Roman" w:cs="Times New Roman" w:eastAsia="Times New Roman"/>
           <w:b/>
           <w:color w:val="000000" w:themeColor="text1"/>
           <w:sz w:val="40"/>
@@ -3530,26 +3479,6 @@
         <w:t>Revision History</w:t>
       </w:r>
       <w:bookmarkEnd w:id="102"/>
-    </w:p>
-    <w:p xmlns:wp14="http://schemas.microsoft.com/office/word/2010/wordml" wp14:textId="77777777">
-      <w:pPr>
-        <w:pStyle w:val="NoSpacing"/>
-        <w:jc w:val="center"/>
-        <w:rPr>
-          <w:sz w:val="40"/>
-          <w:szCs w:val="40"/>
-        </w:rPr>
-      </w:pPr>
-    </w:p>
-    <w:p xmlns:wp14="http://schemas.microsoft.com/office/word/2010/wordml" wp14:textId="77777777">
-      <w:pPr>
-        <w:pStyle w:val="NoSpacing"/>
-        <w:jc w:val="center"/>
-        <w:rPr>
-          <w:sz w:val="40"/>
-          <w:szCs w:val="40"/>
-        </w:rPr>
-      </w:pPr>
     </w:p>
     <w:tbl>
       <w:tblPr>
@@ -3567,10 +3496,12 @@
         <w:tc>
           <w:tcPr>
             <w:tcW w:w="1061" w:type="dxa"/>
+            <w:vAlign w:val="center"/>
           </w:tcPr>
           <w:p wp14:textId="77777777">
             <w:pPr>
               <w:pStyle w:val="NoSpacing"/>
+              <w:jc w:val="center"/>
               <w:rPr>
                 <w:b/>
                 <w:szCs w:val="24"/>
@@ -3578,20 +3509,49 @@
             </w:pPr>
             <w:r>
               <w:rPr>
+                <w:rFonts w:ascii="Times New Roman" w:hAnsi="Times New Roman" w:cs="Times New Roman" w:eastAsia="Times New Roman"/>
+                <w:b/>
+                <w:sz w:val="24"/>
+                <w:szCs w:val="24"/>
+              </w:rPr>
+              <w:t>Date</w:t>
+            </w:r>
+          </w:p>
+        </w:tc>
+        <w:tc>
+          <w:tcPr>
+            <w:tcW w:w="3320" w:type="dxa"/>
+            <w:vAlign w:val="center"/>
+          </w:tcPr>
+          <w:p wp14:textId="77777777">
+            <w:pPr>
+              <w:pStyle w:val="NoSpacing"/>
+              <w:jc w:val="center"/>
+              <w:rPr>
                 <w:b/>
                 <w:szCs w:val="24"/>
               </w:rPr>
-              <w:t>Date</w:t>
-            </w:r>
-          </w:p>
-        </w:tc>
-        <w:tc>
-          <w:tcPr>
-            <w:tcW w:w="3320" w:type="dxa"/>
+            </w:pPr>
+            <w:r>
+              <w:rPr>
+                <w:rFonts w:ascii="Times New Roman" w:hAnsi="Times New Roman" w:cs="Times New Roman" w:eastAsia="Times New Roman"/>
+                <w:b/>
+                <w:sz w:val="24"/>
+                <w:szCs w:val="24"/>
+              </w:rPr>
+              <w:t>Change</w:t>
+            </w:r>
+          </w:p>
+        </w:tc>
+        <w:tc>
+          <w:tcPr>
+            <w:tcW w:w="2361" w:type="dxa"/>
+            <w:vAlign w:val="center"/>
           </w:tcPr>
           <w:p wp14:textId="77777777">
             <w:pPr>
               <w:pStyle w:val="NoSpacing"/>
+              <w:jc w:val="center"/>
               <w:rPr>
                 <w:b/>
                 <w:szCs w:val="24"/>
@@ -3599,64 +3559,51 @@
             </w:pPr>
             <w:r>
               <w:rPr>
+                <w:rFonts w:ascii="Times New Roman" w:hAnsi="Times New Roman" w:cs="Times New Roman" w:eastAsia="Times New Roman"/>
+                <w:b/>
+                <w:sz w:val="24"/>
+                <w:szCs w:val="24"/>
+              </w:rPr>
+              <w:t>Reason for Changes</w:t>
+            </w:r>
+          </w:p>
+        </w:tc>
+        <w:tc>
+          <w:tcPr>
+            <w:tcW w:w="2274" w:type="dxa"/>
+            <w:vAlign w:val="center"/>
+          </w:tcPr>
+          <w:p wp14:textId="77777777">
+            <w:pPr>
+              <w:pStyle w:val="NoSpacing"/>
+              <w:jc w:val="center"/>
+              <w:rPr>
                 <w:b/>
                 <w:szCs w:val="24"/>
               </w:rPr>
-              <w:t>Change</w:t>
-            </w:r>
-          </w:p>
-        </w:tc>
-        <w:tc>
-          <w:tcPr>
-            <w:tcW w:w="2361" w:type="dxa"/>
+            </w:pPr>
+            <w:r>
+              <w:rPr>
+                <w:rFonts w:ascii="Times New Roman" w:hAnsi="Times New Roman" w:cs="Times New Roman" w:eastAsia="Times New Roman"/>
+                <w:b/>
+                <w:sz w:val="24"/>
+                <w:szCs w:val="24"/>
+              </w:rPr>
+              <w:t>Mentor Signature</w:t>
+            </w:r>
+          </w:p>
+        </w:tc>
+      </w:tr>
+      <w:tr xmlns:wp14="http://schemas.microsoft.com/office/word/2010/wordml" wp14:textId="77777777">
+        <w:tc>
+          <w:tcPr>
+            <w:tcW w:w="1061" w:type="dxa"/>
+            <w:vAlign w:val="center"/>
           </w:tcPr>
           <w:p wp14:textId="77777777">
             <w:pPr>
               <w:pStyle w:val="NoSpacing"/>
-              <w:rPr>
-                <w:b/>
-                <w:szCs w:val="24"/>
-              </w:rPr>
-            </w:pPr>
-            <w:r>
-              <w:rPr>
-                <w:b/>
-                <w:szCs w:val="24"/>
-              </w:rPr>
-              <w:t>Reason for Changes</w:t>
-            </w:r>
-          </w:p>
-        </w:tc>
-        <w:tc>
-          <w:tcPr>
-            <w:tcW w:w="2274" w:type="dxa"/>
-          </w:tcPr>
-          <w:p wp14:textId="77777777">
-            <w:pPr>
-              <w:pStyle w:val="NoSpacing"/>
-              <w:rPr>
-                <w:b/>
-                <w:szCs w:val="24"/>
-              </w:rPr>
-            </w:pPr>
-            <w:r>
-              <w:rPr>
-                <w:b/>
-                <w:szCs w:val="24"/>
-              </w:rPr>
-              <w:t>Mentor Signature</w:t>
-            </w:r>
-          </w:p>
-        </w:tc>
-      </w:tr>
-      <w:tr xmlns:wp14="http://schemas.microsoft.com/office/word/2010/wordml" wp14:textId="77777777">
-        <w:tc>
-          <w:tcPr>
-            <w:tcW w:w="1061" w:type="dxa"/>
-          </w:tcPr>
-          <w:p wp14:textId="77777777">
-            <w:pPr>
-              <w:pStyle w:val="NoSpacing"/>
+              <w:jc w:val="center"/>
               <w:rPr>
                 <w:sz w:val="40"/>
                 <w:szCs w:val="40"/>
@@ -3665,7 +3612,8 @@
             <w:r>
               <w:rPr>
                 <w:rFonts w:ascii="Times New Roman" w:hAnsi="Times New Roman" w:cs="Times New Roman" w:eastAsia="Times New Roman"/>
-                <w:sz w:val="20"/>
+                <w:b w:val="0"/>
+                <w:sz w:val="24"/>
               </w:rPr>
               <w:t>07-10-2026</w:t>
             </w:r>
@@ -3674,10 +3622,12 @@
         <w:tc>
           <w:tcPr>
             <w:tcW w:w="3320" w:type="dxa"/>
+            <w:vAlign w:val="center"/>
           </w:tcPr>
           <w:p wp14:textId="77777777">
             <w:pPr>
               <w:pStyle w:val="NoSpacing"/>
+              <w:jc w:val="center"/>
               <w:rPr>
                 <w:sz w:val="40"/>
                 <w:szCs w:val="40"/>
@@ -3686,7 +3636,8 @@
             <w:r>
               <w:rPr>
                 <w:rFonts w:ascii="Times New Roman" w:hAnsi="Times New Roman" w:cs="Times New Roman" w:eastAsia="Times New Roman"/>
-                <w:sz w:val="20"/>
+                <w:b w:val="0"/>
+                <w:sz w:val="24"/>
               </w:rPr>
               <w:t>Version 1.0: mid-term SRS</w:t>
             </w:r>
@@ -3695,10 +3646,12 @@
         <w:tc>
           <w:tcPr>
             <w:tcW w:w="2361" w:type="dxa"/>
+            <w:vAlign w:val="center"/>
           </w:tcPr>
           <w:p wp14:textId="77777777">
             <w:pPr>
               <w:pStyle w:val="NoSpacing"/>
+              <w:jc w:val="center"/>
               <w:rPr>
                 <w:sz w:val="40"/>
                 <w:szCs w:val="40"/>
@@ -3707,7 +3660,8 @@
             <w:r>
               <w:rPr>
                 <w:rFonts w:ascii="Times New Roman" w:hAnsi="Times New Roman" w:cs="Times New Roman" w:eastAsia="Times New Roman"/>
-                <w:sz w:val="20"/>
+                <w:b w:val="0"/>
+                <w:sz w:val="24"/>
               </w:rPr>
               <w:t>Requirements, design and status updated after the first-half implementation and the 50-site pilot</w:t>
             </w:r>
@@ -3716,10 +3670,12 @@
         <w:tc>
           <w:tcPr>
             <w:tcW w:w="2274" w:type="dxa"/>
+            <w:vAlign w:val="center"/>
           </w:tcPr>
           <w:p wp14:textId="77777777">
             <w:pPr>
               <w:pStyle w:val="NoSpacing"/>
+              <w:jc w:val="center"/>
               <w:rPr>
                 <w:sz w:val="40"/>
                 <w:szCs w:val="40"/>
@@ -3728,7 +3684,8 @@
             <w:r>
               <w:rPr>
                 <w:rFonts w:ascii="Times New Roman" w:hAnsi="Times New Roman" w:cs="Times New Roman" w:eastAsia="Times New Roman"/>
-                <w:sz w:val="20"/>
+                <w:b w:val="0"/>
+                <w:sz w:val="24"/>
               </w:rPr>
             </w:r>
           </w:p>
@@ -3738,10 +3695,12 @@
         <w:tc>
           <w:tcPr>
             <w:tcW w:w="1061" w:type="dxa"/>
+            <w:vAlign w:val="center"/>
           </w:tcPr>
           <w:p wp14:textId="77777777">
             <w:pPr>
               <w:pStyle w:val="NoSpacing"/>
+              <w:jc w:val="center"/>
               <w:rPr>
                 <w:sz w:val="40"/>
                 <w:szCs w:val="40"/>
@@ -3752,10 +3711,12 @@
         <w:tc>
           <w:tcPr>
             <w:tcW w:w="3320" w:type="dxa"/>
+            <w:vAlign w:val="center"/>
           </w:tcPr>
           <w:p wp14:textId="77777777">
             <w:pPr>
               <w:pStyle w:val="NoSpacing"/>
+              <w:jc w:val="center"/>
               <w:rPr>
                 <w:sz w:val="40"/>
                 <w:szCs w:val="40"/>
@@ -3766,10 +3727,12 @@
         <w:tc>
           <w:tcPr>
             <w:tcW w:w="2361" w:type="dxa"/>
+            <w:vAlign w:val="center"/>
           </w:tcPr>
           <w:p wp14:textId="77777777">
             <w:pPr>
               <w:pStyle w:val="NoSpacing"/>
+              <w:jc w:val="center"/>
               <w:rPr>
                 <w:sz w:val="40"/>
                 <w:szCs w:val="40"/>
@@ -3780,10 +3743,12 @@
         <w:tc>
           <w:tcPr>
             <w:tcW w:w="2274" w:type="dxa"/>
+            <w:vAlign w:val="center"/>
           </w:tcPr>
           <w:p wp14:textId="77777777">
             <w:pPr>
               <w:pStyle w:val="NoSpacing"/>
+              <w:jc w:val="center"/>
               <w:rPr>
                 <w:sz w:val="40"/>
                 <w:szCs w:val="40"/>
@@ -3796,10 +3761,12 @@
         <w:tc>
           <w:tcPr>
             <w:tcW w:w="1061" w:type="dxa"/>
+            <w:vAlign w:val="center"/>
           </w:tcPr>
           <w:p wp14:textId="77777777">
             <w:pPr>
               <w:pStyle w:val="NoSpacing"/>
+              <w:jc w:val="center"/>
               <w:rPr>
                 <w:sz w:val="40"/>
                 <w:szCs w:val="40"/>
@@ -3810,10 +3777,12 @@
         <w:tc>
           <w:tcPr>
             <w:tcW w:w="3320" w:type="dxa"/>
+            <w:vAlign w:val="center"/>
           </w:tcPr>
           <w:p wp14:textId="77777777">
             <w:pPr>
               <w:pStyle w:val="NoSpacing"/>
+              <w:jc w:val="center"/>
               <w:rPr>
                 <w:sz w:val="40"/>
                 <w:szCs w:val="40"/>
@@ -3824,10 +3793,12 @@
         <w:tc>
           <w:tcPr>
             <w:tcW w:w="2361" w:type="dxa"/>
+            <w:vAlign w:val="center"/>
           </w:tcPr>
           <w:p wp14:textId="77777777">
             <w:pPr>
               <w:pStyle w:val="NoSpacing"/>
+              <w:jc w:val="center"/>
               <w:rPr>
                 <w:sz w:val="40"/>
                 <w:szCs w:val="40"/>
@@ -3838,10 +3809,12 @@
         <w:tc>
           <w:tcPr>
             <w:tcW w:w="2274" w:type="dxa"/>
+            <w:vAlign w:val="center"/>
           </w:tcPr>
           <w:p wp14:textId="77777777">
             <w:pPr>
               <w:pStyle w:val="NoSpacing"/>
+              <w:jc w:val="center"/>
               <w:rPr>
                 <w:sz w:val="40"/>
                 <w:szCs w:val="40"/>
@@ -3854,10 +3827,12 @@
         <w:tc>
           <w:tcPr>
             <w:tcW w:w="1061" w:type="dxa"/>
+            <w:vAlign w:val="center"/>
           </w:tcPr>
           <w:p wp14:textId="77777777">
             <w:pPr>
               <w:pStyle w:val="NoSpacing"/>
+              <w:jc w:val="center"/>
               <w:rPr>
                 <w:sz w:val="40"/>
                 <w:szCs w:val="40"/>
@@ -3868,10 +3843,12 @@
         <w:tc>
           <w:tcPr>
             <w:tcW w:w="3320" w:type="dxa"/>
+            <w:vAlign w:val="center"/>
           </w:tcPr>
           <w:p wp14:textId="77777777">
             <w:pPr>
               <w:pStyle w:val="NoSpacing"/>
+              <w:jc w:val="center"/>
               <w:rPr>
                 <w:sz w:val="40"/>
                 <w:szCs w:val="40"/>
@@ -3882,10 +3859,12 @@
         <w:tc>
           <w:tcPr>
             <w:tcW w:w="2361" w:type="dxa"/>
+            <w:vAlign w:val="center"/>
           </w:tcPr>
           <w:p wp14:textId="77777777">
             <w:pPr>
               <w:pStyle w:val="NoSpacing"/>
+              <w:jc w:val="center"/>
               <w:rPr>
                 <w:sz w:val="40"/>
                 <w:szCs w:val="40"/>
@@ -3896,10 +3875,12 @@
         <w:tc>
           <w:tcPr>
             <w:tcW w:w="2274" w:type="dxa"/>
+            <w:vAlign w:val="center"/>
           </w:tcPr>
           <w:p wp14:textId="77777777">
             <w:pPr>
               <w:pStyle w:val="NoSpacing"/>
+              <w:jc w:val="center"/>
               <w:rPr>
                 <w:sz w:val="40"/>
                 <w:szCs w:val="40"/>

</xml_diff>